<commit_message>
Updated documents from Kylie
</commit_message>
<xml_diff>
--- a/multi-agent-demo/docs/Confluent_IBM-1.30.2024.docx
+++ b/multi-agent-demo/docs/Confluent_IBM-1.30.2024.docx
@@ -1,6 +1,6 @@
 
 <file path=word/document.xml><?xml version="1.0" encoding="utf-8"?>
-<w:document xmlns:wpc="http://schemas.microsoft.com/office/word/2010/wordprocessingCanvas" xmlns:cx="http://schemas.microsoft.com/office/drawing/2014/chartex" xmlns:cx1="http://schemas.microsoft.com/office/drawing/2015/9/8/chartex" xmlns:cx2="http://schemas.microsoft.com/office/drawing/2015/10/21/chartex" xmlns:cx3="http://schemas.microsoft.com/office/drawing/2016/5/9/chartex" xmlns:cx4="http://schemas.microsoft.com/office/drawing/2016/5/10/chartex" xmlns:cx5="http://schemas.microsoft.com/office/drawing/2016/5/11/chartex" xmlns:cx6="http://schemas.microsoft.com/office/drawing/2016/5/12/chartex" xmlns:cx7="http://schemas.microsoft.com/office/drawing/2016/5/13/chartex" xmlns:cx8="http://schemas.microsoft.com/office/drawing/2016/5/14/chartex" xmlns:mc="http://schemas.openxmlformats.org/markup-compatibility/2006" xmlns:aink="http://schemas.microsoft.com/office/drawing/2016/ink" xmlns:am3d="http://schemas.microsoft.com/office/drawing/2017/model3d" xmlns:o="urn:schemas-microsoft-com:office:office" xmlns:oel="http://schemas.microsoft.com/office/2019/extlst" xmlns:r="http://schemas.openxmlformats.org/officeDocument/2006/relationships" xmlns:m="http://schemas.openxmlformats.org/officeDocument/2006/math" xmlns:v="urn:schemas-microsoft-com:vml" xmlns:wp14="http://schemas.microsoft.com/office/word/2010/wordprocessingDrawing" xmlns:wp="http://schemas.openxmlformats.org/drawingml/2006/wordprocessingDrawing" xmlns:w10="urn:schemas-microsoft-com:office:word" xmlns:w="http://schemas.openxmlformats.org/wordprocessingml/2006/main" xmlns:w14="http://schemas.microsoft.com/office/word/2010/wordml" xmlns:w15="http://schemas.microsoft.com/office/word/2012/wordml" xmlns:w16cex="http://schemas.microsoft.com/office/word/2018/wordml/cex" xmlns:w16cid="http://schemas.microsoft.com/office/word/2016/wordml/cid" xmlns:w16="http://schemas.microsoft.com/office/word/2018/wordml" xmlns:w16du="http://schemas.microsoft.com/office/word/2023/wordml/word16du" xmlns:w16sdtdh="http://schemas.microsoft.com/office/word/2020/wordml/sdtdatahash" xmlns:w16sdtfl="http://schemas.microsoft.com/office/word/2024/wordml/sdtformatlock" xmlns:w16se="http://schemas.microsoft.com/office/word/2015/wordml/symex" xmlns:wpg="http://schemas.microsoft.com/office/word/2010/wordprocessingGroup" xmlns:wpi="http://schemas.microsoft.com/office/word/2010/wordprocessingInk" xmlns:wne="http://schemas.microsoft.com/office/word/2006/wordml" xmlns:wps="http://schemas.microsoft.com/office/word/2010/wordprocessingShape" mc:Ignorable="w14 w15 w16se w16cid w16 w16cex w16sdtdh w16sdtfl w16du wp14">
+<w:document xmlns:wpc="http://schemas.microsoft.com/office/word/2010/wordprocessingCanvas" xmlns:cx="http://schemas.microsoft.com/office/drawing/2014/chartex" xmlns:cx1="http://schemas.microsoft.com/office/drawing/2015/9/8/chartex" xmlns:cx2="http://schemas.microsoft.com/office/drawing/2015/10/21/chartex" xmlns:cx3="http://schemas.microsoft.com/office/drawing/2016/5/9/chartex" xmlns:cx4="http://schemas.microsoft.com/office/drawing/2016/5/10/chartex" xmlns:cx5="http://schemas.microsoft.com/office/drawing/2016/5/11/chartex" xmlns:cx6="http://schemas.microsoft.com/office/drawing/2016/5/12/chartex" xmlns:cx7="http://schemas.microsoft.com/office/drawing/2016/5/13/chartex" xmlns:cx8="http://schemas.microsoft.com/office/drawing/2016/5/14/chartex" xmlns:mc="http://schemas.openxmlformats.org/markup-compatibility/2006" xmlns:aink="http://schemas.microsoft.com/office/drawing/2016/ink" xmlns:am3d="http://schemas.microsoft.com/office/drawing/2017/model3d" xmlns:o="urn:schemas-microsoft-com:office:office" xmlns:oel="http://schemas.microsoft.com/office/2019/extlst" xmlns:r="http://schemas.openxmlformats.org/officeDocument/2006/relationships" xmlns:m="http://schemas.openxmlformats.org/officeDocument/2006/math" xmlns:v="urn:schemas-microsoft-com:vml" xmlns:wp14="http://schemas.microsoft.com/office/word/2010/wordprocessingDrawing" xmlns:wp="http://schemas.openxmlformats.org/drawingml/2006/wordprocessingDrawing" xmlns:w10="urn:schemas-microsoft-com:office:word" xmlns:w="http://schemas.openxmlformats.org/wordprocessingml/2006/main" xmlns:w14="http://schemas.microsoft.com/office/word/2010/wordml" xmlns:w15="http://schemas.microsoft.com/office/word/2012/wordml" xmlns:w16cex="http://schemas.microsoft.com/office/word/2018/wordml/cex" xmlns:w16cid="http://schemas.microsoft.com/office/word/2016/wordml/cid" xmlns:w16="http://schemas.microsoft.com/office/word/2018/wordml" xmlns:w16du="http://schemas.microsoft.com/office/word/2023/wordml/word16du" xmlns:w16sdtdh="http://schemas.microsoft.com/office/word/2020/wordml/sdtdatahash" xmlns:w16sdtfl="http://schemas.microsoft.com/office/word/2024/wordml/sdtformatlock" xmlns:w16se="http://schemas.microsoft.com/office/word/2015/wordml/symex" xmlns:wpg="http://schemas.microsoft.com/office/word/2010/wordprocessingGroup" xmlns:wpi="http://schemas.microsoft.com/office/word/2010/wordprocessingInk" xmlns:wne="http://schemas.microsoft.com/office/word/2006/wordml" xmlns:wps="http://schemas.microsoft.com/office/word/2010/wordprocessingShape" xmlns:a="http://schemas.openxmlformats.org/drawingml/2006/main" xmlns:pic="http://schemas.openxmlformats.org/drawingml/2006/picture" xmlns:a14="http://schemas.microsoft.com/office/drawing/2010/main" mc:Ignorable="w14 w15 w16se w16cid w16 w16cex w16sdtdh w16sdtfl w16du wp14">
   <w:body>
     <w:p>
       <w:pPr>
@@ -696,7 +696,6 @@
         <w:rPr>
           <w:noProof/>
         </w:rPr>
-        <w:lastRenderedPageBreak/>
         <w:drawing>
           <wp:anchor distT="0" distB="0" distL="114300" distR="114300" simplePos="0" relativeHeight="251660288" behindDoc="0" locked="0" layoutInCell="1" allowOverlap="1" wp14:anchorId="7A743847" wp14:editId="579FECB5">
             <wp:simplePos x="0" y="0"/>
@@ -976,7 +975,7 @@
         </w:rPr>
         <w:t xml:space="preserve"> agrees to pay the applicable charges associated with such account as specified in the IBM invoice. The following link includes information on closing an account:  </w:t>
       </w:r>
-      <w:hyperlink r:id="rId8" w:anchor="cancelaccount" w:history="1">
+      <w:hyperlink w:history="1" w:anchor="cancelaccount" r:id="rId8">
         <w:r>
           <w:rPr>
             <w:rStyle w:val="Hyperlink"/>
@@ -1035,7 +1034,7 @@
       <w:r>
         <w:t xml:space="preserve"> (defined as the portal at </w:t>
       </w:r>
-      <w:hyperlink r:id="rId9" w:history="1">
+      <w:hyperlink w:history="1" r:id="rId9">
         <w:r>
           <w:rPr>
             <w:rStyle w:val="Hyperlink"/>
@@ -1083,12 +1082,12 @@
         <w:tblW w:w="4634" w:type="pct"/>
         <w:tblInd w:w="737" w:type="dxa"/>
         <w:tblBorders>
-          <w:top w:val="single" w:sz="4" w:space="0" w:color="auto"/>
-          <w:left w:val="single" w:sz="4" w:space="0" w:color="auto"/>
-          <w:bottom w:val="single" w:sz="4" w:space="0" w:color="auto"/>
-          <w:right w:val="single" w:sz="4" w:space="0" w:color="auto"/>
-          <w:insideH w:val="single" w:sz="4" w:space="0" w:color="auto"/>
-          <w:insideV w:val="single" w:sz="4" w:space="0" w:color="auto"/>
+          <w:top w:val="single" w:color="auto" w:sz="4" w:space="0"/>
+          <w:left w:val="single" w:color="auto" w:sz="4" w:space="0"/>
+          <w:bottom w:val="single" w:color="auto" w:sz="4" w:space="0"/>
+          <w:right w:val="single" w:color="auto" w:sz="4" w:space="0"/>
+          <w:insideH w:val="single" w:color="auto" w:sz="4" w:space="0"/>
+          <w:insideV w:val="single" w:color="auto" w:sz="4" w:space="0"/>
         </w:tblBorders>
         <w:tblCellMar>
           <w:top w:w="57" w:type="dxa"/>
@@ -1482,7 +1481,6 @@
         <w:pStyle w:val="CNParagraph"/>
       </w:pPr>
       <w:r>
-        <w:lastRenderedPageBreak/>
         <w:t xml:space="preserve">IBM Cloud Support descriptions can be found at the following: </w:t>
       </w:r>
     </w:p>
@@ -1495,7 +1493,7 @@
         </w:tabs>
         <w:ind w:left="1224" w:hanging="504"/>
       </w:pPr>
-      <w:hyperlink r:id="rId10" w:history="1">
+      <w:hyperlink w:history="1" r:id="rId10">
         <w:r>
           <w:rPr>
             <w:rStyle w:val="Hyperlink"/>
@@ -1513,7 +1511,7 @@
         </w:tabs>
         <w:ind w:left="1224" w:hanging="504"/>
       </w:pPr>
-      <w:hyperlink r:id="rId11" w:history="1">
+      <w:hyperlink w:history="1" r:id="rId11">
         <w:r>
           <w:rPr>
             <w:rStyle w:val="Hyperlink"/>
@@ -1553,14 +1551,55 @@
         <w:pStyle w:val="CNLevel1Text"/>
       </w:pPr>
       <w:r>
-        <w:t xml:space="preserve">Prices are based upon a committed order value of $500,092.80. This is the minimum order value that BP commits to purchase during the term of this TD. If BP has not attained the commitment, BP agrees to submit to IBM a purchase order for Products in the amount of the remaining balance within 7 days of the end of the TD term. If BP fails to submit such purchase order, IBM may invoice BP the remaining balance and such invoice will include Cloud Services and part </w:t>
-      </w:r>
-      <w:proofErr w:type="gramStart"/>
-      <w:r>
+        <w:rPr/>
+        <w:t xml:space="preserve">Prices are based upon a committed order value of $250,003.20. This is the minimum order value that BP commits to purchase during the term of this TD. If BP has not </w:t>
+      </w:r>
+      <w:r>
+        <w:rPr/>
+        <w:t>attained</w:t>
+      </w:r>
+      <w:r>
+        <w:rPr/>
+        <w:t xml:space="preserve"> the commitment, BP agrees to </w:t>
+      </w:r>
+      <w:r>
+        <w:rPr/>
+        <w:t>submit</w:t>
+      </w:r>
+      <w:r>
+        <w:rPr/>
+        <w:t xml:space="preserve"> to IBM a purchase order for Products </w:t>
+      </w:r>
+      <w:r>
+        <w:rPr/>
+        <w:t>in the amount of</w:t>
+      </w:r>
+      <w:r>
+        <w:rPr/>
+        <w:t xml:space="preserve"> the remaining balance within 7 days of the end of the TD term. If BP </w:t>
+      </w:r>
+      <w:r>
+        <w:rPr/>
+        <w:t>fails to</w:t>
+      </w:r>
+      <w:r>
+        <w:rPr/>
+        <w:t xml:space="preserve"> </w:t>
+      </w:r>
+      <w:r>
+        <w:rPr/>
+        <w:t>submit</w:t>
+      </w:r>
+      <w:r>
+        <w:rPr/>
+        <w:t xml:space="preserve"> such purchase order, IBM may invoice BP the remaining balance and such invoice will include Cloud Services and part </w:t>
+      </w:r>
+      <w:r>
+        <w:rPr/>
         <w:t>numbers</w:t>
       </w:r>
-      <w:proofErr w:type="gramEnd"/>
-      <w:r>
+      <w:r>
+        <w:rPr/>
         <w:t xml:space="preserve"> and BP shall pay IBM for such amount.</w:t>
       </w:r>
     </w:p>
@@ -1592,7 +1631,7 @@
       <w:r>
         <w:t xml:space="preserve"> </w:t>
       </w:r>
-      <w:hyperlink r:id="rId12" w:history="1">
+      <w:hyperlink w:history="1" r:id="rId12">
         <w:r>
           <w:rPr>
             <w:rStyle w:val="Hyperlink"/>
@@ -1633,7 +1672,7 @@
         </w:rPr>
         <w:t xml:space="preserve">:  </w:t>
       </w:r>
-      <w:hyperlink r:id="rId13" w:anchor="search-result" w:history="1">
+      <w:hyperlink w:history="1" w:anchor="search-result" r:id="rId13">
         <w:r>
           <w:rPr>
             <w:rStyle w:val="Hyperlink"/>
@@ -1723,12 +1762,12 @@
         <w:tblW w:w="4600" w:type="pct"/>
         <w:tblInd w:w="737" w:type="dxa"/>
         <w:tblBorders>
-          <w:top w:val="single" w:sz="8" w:space="0" w:color="000000"/>
-          <w:left w:val="single" w:sz="8" w:space="0" w:color="000000"/>
-          <w:bottom w:val="single" w:sz="8" w:space="0" w:color="000000"/>
-          <w:right w:val="single" w:sz="8" w:space="0" w:color="000000"/>
-          <w:insideH w:val="single" w:sz="8" w:space="0" w:color="000000"/>
-          <w:insideV w:val="single" w:sz="8" w:space="0" w:color="000000"/>
+          <w:top w:val="single" w:color="000000" w:sz="8" w:space="0"/>
+          <w:left w:val="single" w:color="000000" w:sz="8" w:space="0"/>
+          <w:bottom w:val="single" w:color="000000" w:sz="8" w:space="0"/>
+          <w:right w:val="single" w:color="000000" w:sz="8" w:space="0"/>
+          <w:insideH w:val="single" w:color="000000" w:sz="8" w:space="0"/>
+          <w:insideV w:val="single" w:color="000000" w:sz="8" w:space="0"/>
         </w:tblBorders>
         <w:tblCellMar>
           <w:top w:w="57" w:type="dxa"/>
@@ -1750,10 +1789,10 @@
           <w:tcPr>
             <w:tcW w:w="2500" w:type="pct"/>
             <w:tcBorders>
-              <w:top w:val="single" w:sz="8" w:space="0" w:color="000000"/>
-              <w:left w:val="single" w:sz="8" w:space="0" w:color="000000"/>
-              <w:bottom w:val="single" w:sz="8" w:space="0" w:color="000000"/>
-              <w:right w:val="single" w:sz="8" w:space="0" w:color="000000"/>
+              <w:top w:val="single" w:color="000000" w:sz="8" w:space="0"/>
+              <w:left w:val="single" w:color="000000" w:sz="8" w:space="0"/>
+              <w:bottom w:val="single" w:color="000000" w:sz="8" w:space="0"/>
+              <w:right w:val="single" w:color="000000" w:sz="8" w:space="0"/>
             </w:tcBorders>
             <w:shd w:val="clear" w:color="auto" w:fill="D9D9D9" w:themeFill="background1" w:themeFillShade="D9"/>
           </w:tcPr>
@@ -1771,10 +1810,10 @@
           <w:tcPr>
             <w:tcW w:w="2500" w:type="pct"/>
             <w:tcBorders>
-              <w:top w:val="single" w:sz="8" w:space="0" w:color="000000"/>
-              <w:left w:val="single" w:sz="8" w:space="0" w:color="000000"/>
-              <w:bottom w:val="single" w:sz="8" w:space="0" w:color="000000"/>
-              <w:right w:val="single" w:sz="8" w:space="0" w:color="000000"/>
+              <w:top w:val="single" w:color="000000" w:sz="8" w:space="0"/>
+              <w:left w:val="single" w:color="000000" w:sz="8" w:space="0"/>
+              <w:bottom w:val="single" w:color="000000" w:sz="8" w:space="0"/>
+              <w:right w:val="single" w:color="000000" w:sz="8" w:space="0"/>
             </w:tcBorders>
             <w:shd w:val="clear" w:color="000000" w:fill="FFFFFF"/>
           </w:tcPr>
@@ -1797,10 +1836,10 @@
           <w:tcPr>
             <w:tcW w:w="2500" w:type="pct"/>
             <w:tcBorders>
-              <w:top w:val="single" w:sz="8" w:space="0" w:color="000000"/>
-              <w:left w:val="single" w:sz="8" w:space="0" w:color="000000"/>
-              <w:bottom w:val="single" w:sz="8" w:space="0" w:color="000000"/>
-              <w:right w:val="single" w:sz="8" w:space="0" w:color="000000"/>
+              <w:top w:val="single" w:color="000000" w:sz="8" w:space="0"/>
+              <w:left w:val="single" w:color="000000" w:sz="8" w:space="0"/>
+              <w:bottom w:val="single" w:color="000000" w:sz="8" w:space="0"/>
+              <w:right w:val="single" w:color="000000" w:sz="8" w:space="0"/>
             </w:tcBorders>
             <w:shd w:val="clear" w:color="auto" w:fill="D9D9D9" w:themeFill="background1" w:themeFillShade="D9"/>
           </w:tcPr>
@@ -1818,10 +1857,10 @@
           <w:tcPr>
             <w:tcW w:w="2500" w:type="pct"/>
             <w:tcBorders>
-              <w:top w:val="single" w:sz="8" w:space="0" w:color="000000"/>
-              <w:left w:val="single" w:sz="8" w:space="0" w:color="000000"/>
-              <w:bottom w:val="single" w:sz="8" w:space="0" w:color="000000"/>
-              <w:right w:val="single" w:sz="8" w:space="0" w:color="000000"/>
+              <w:top w:val="single" w:color="000000" w:sz="8" w:space="0"/>
+              <w:left w:val="single" w:color="000000" w:sz="8" w:space="0"/>
+              <w:bottom w:val="single" w:color="000000" w:sz="8" w:space="0"/>
+              <w:right w:val="single" w:color="000000" w:sz="8" w:space="0"/>
             </w:tcBorders>
             <w:shd w:val="clear" w:color="000000" w:fill="FFFFFF"/>
           </w:tcPr>
@@ -1844,10 +1883,10 @@
           <w:tcPr>
             <w:tcW w:w="2500" w:type="pct"/>
             <w:tcBorders>
-              <w:top w:val="single" w:sz="8" w:space="0" w:color="000000"/>
-              <w:left w:val="single" w:sz="8" w:space="0" w:color="000000"/>
-              <w:bottom w:val="single" w:sz="8" w:space="0" w:color="000000"/>
-              <w:right w:val="single" w:sz="8" w:space="0" w:color="000000"/>
+              <w:top w:val="single" w:color="000000" w:sz="8" w:space="0"/>
+              <w:left w:val="single" w:color="000000" w:sz="8" w:space="0"/>
+              <w:bottom w:val="single" w:color="000000" w:sz="8" w:space="0"/>
+              <w:right w:val="single" w:color="000000" w:sz="8" w:space="0"/>
             </w:tcBorders>
             <w:shd w:val="clear" w:color="auto" w:fill="D9D9D9" w:themeFill="background1" w:themeFillShade="D9"/>
           </w:tcPr>
@@ -1867,10 +1906,10 @@
           <w:tcPr>
             <w:tcW w:w="2500" w:type="pct"/>
             <w:tcBorders>
-              <w:top w:val="single" w:sz="8" w:space="0" w:color="000000"/>
-              <w:left w:val="single" w:sz="8" w:space="0" w:color="000000"/>
-              <w:bottom w:val="single" w:sz="8" w:space="0" w:color="000000"/>
-              <w:right w:val="single" w:sz="8" w:space="0" w:color="000000"/>
+              <w:top w:val="single" w:color="000000" w:sz="8" w:space="0"/>
+              <w:left w:val="single" w:color="000000" w:sz="8" w:space="0"/>
+              <w:bottom w:val="single" w:color="000000" w:sz="8" w:space="0"/>
+              <w:right w:val="single" w:color="000000" w:sz="8" w:space="0"/>
             </w:tcBorders>
             <w:shd w:val="clear" w:color="000000" w:fill="FFFFFF"/>
           </w:tcPr>
@@ -1901,10 +1940,10 @@
           <w:tcPr>
             <w:tcW w:w="2500" w:type="pct"/>
             <w:tcBorders>
-              <w:top w:val="single" w:sz="8" w:space="0" w:color="000000"/>
-              <w:left w:val="single" w:sz="8" w:space="0" w:color="000000"/>
-              <w:bottom w:val="single" w:sz="8" w:space="0" w:color="000000"/>
-              <w:right w:val="single" w:sz="8" w:space="0" w:color="000000"/>
+              <w:top w:val="single" w:color="000000" w:sz="8" w:space="0"/>
+              <w:left w:val="single" w:color="000000" w:sz="8" w:space="0"/>
+              <w:bottom w:val="single" w:color="000000" w:sz="8" w:space="0"/>
+              <w:right w:val="single" w:color="000000" w:sz="8" w:space="0"/>
             </w:tcBorders>
             <w:shd w:val="clear" w:color="auto" w:fill="D9D9D9" w:themeFill="background1" w:themeFillShade="D9"/>
           </w:tcPr>
@@ -1921,10 +1960,10 @@
           <w:tcPr>
             <w:tcW w:w="2500" w:type="pct"/>
             <w:tcBorders>
-              <w:top w:val="single" w:sz="8" w:space="0" w:color="000000"/>
-              <w:left w:val="single" w:sz="8" w:space="0" w:color="000000"/>
-              <w:bottom w:val="single" w:sz="8" w:space="0" w:color="000000"/>
-              <w:right w:val="single" w:sz="8" w:space="0" w:color="000000"/>
+              <w:top w:val="single" w:color="000000" w:sz="8" w:space="0"/>
+              <w:left w:val="single" w:color="000000" w:sz="8" w:space="0"/>
+              <w:bottom w:val="single" w:color="000000" w:sz="8" w:space="0"/>
+              <w:right w:val="single" w:color="000000" w:sz="8" w:space="0"/>
             </w:tcBorders>
             <w:shd w:val="clear" w:color="000000" w:fill="FFFFFF"/>
           </w:tcPr>
@@ -2051,7 +2090,6 @@
         <w:t xml:space="preserve">BP is placing the following order for the Cloud Services subscription(s) below upon TD signing. Notwithstanding the terms of this Agreement or our prior practice, payment is not contingent upon issuance of a purchase order. All approvals required to issue payment have been obtained. Billing Frequency is specified in the Initial Order Table below. Amounts are due upon receipt of the invoice </w:t>
       </w:r>
       <w:r>
-        <w:lastRenderedPageBreak/>
         <w:t xml:space="preserve">and payable within 30 days of the invoice date. The bill to, ship to addresses along with specific ordering information and amounts due under this Agreement are included herein or in other documents related hereto. This order is firm and irrevocable. Any additional Cloud Service subscriptions will be ordered and paid for as specified </w:t>
       </w:r>
       <w:r>
@@ -2079,12 +2117,12 @@
       <w:tblPr>
         <w:tblW w:w="5092" w:type="pct"/>
         <w:tblBorders>
-          <w:top w:val="single" w:sz="4" w:space="0" w:color="auto"/>
-          <w:left w:val="single" w:sz="4" w:space="0" w:color="auto"/>
-          <w:bottom w:val="single" w:sz="4" w:space="0" w:color="auto"/>
-          <w:right w:val="single" w:sz="4" w:space="0" w:color="auto"/>
-          <w:insideH w:val="single" w:sz="4" w:space="0" w:color="auto"/>
-          <w:insideV w:val="single" w:sz="4" w:space="0" w:color="auto"/>
+          <w:top w:val="single" w:color="auto" w:sz="4" w:space="0"/>
+          <w:left w:val="single" w:color="auto" w:sz="4" w:space="0"/>
+          <w:bottom w:val="single" w:color="auto" w:sz="4" w:space="0"/>
+          <w:right w:val="single" w:color="auto" w:sz="4" w:space="0"/>
+          <w:insideH w:val="single" w:color="auto" w:sz="4" w:space="0"/>
+          <w:insideV w:val="single" w:color="auto" w:sz="4" w:space="0"/>
         </w:tblBorders>
         <w:tblLayout w:type="fixed"/>
         <w:tblCellMar>
@@ -2661,7 +2699,7 @@
       <w:r>
         <w:t xml:space="preserve">Electronically: </w:t>
       </w:r>
-      <w:hyperlink r:id="rId14" w:history="1">
+      <w:hyperlink w:history="1" r:id="rId14">
         <w:r>
           <w:rPr>
             <w:rStyle w:val="Hyperlink"/>
@@ -2749,12 +2787,12 @@
         <w:tblW w:w="4600" w:type="pct"/>
         <w:tblInd w:w="737" w:type="dxa"/>
         <w:tblBorders>
-          <w:top w:val="single" w:sz="8" w:space="0" w:color="000000"/>
-          <w:left w:val="single" w:sz="8" w:space="0" w:color="000000"/>
-          <w:bottom w:val="single" w:sz="8" w:space="0" w:color="000000"/>
-          <w:right w:val="single" w:sz="8" w:space="0" w:color="000000"/>
-          <w:insideH w:val="single" w:sz="8" w:space="0" w:color="000000"/>
-          <w:insideV w:val="single" w:sz="8" w:space="0" w:color="000000"/>
+          <w:top w:val="single" w:color="000000" w:sz="8" w:space="0"/>
+          <w:left w:val="single" w:color="000000" w:sz="8" w:space="0"/>
+          <w:bottom w:val="single" w:color="000000" w:sz="8" w:space="0"/>
+          <w:right w:val="single" w:color="000000" w:sz="8" w:space="0"/>
+          <w:insideH w:val="single" w:color="000000" w:sz="8" w:space="0"/>
+          <w:insideV w:val="single" w:color="000000" w:sz="8" w:space="0"/>
         </w:tblBorders>
         <w:tblCellMar>
           <w:top w:w="57" w:type="dxa"/>
@@ -2778,10 +2816,10 @@
           <w:tcPr>
             <w:tcW w:w="1000" w:type="pct"/>
             <w:tcBorders>
-              <w:top w:val="single" w:sz="8" w:space="0" w:color="000000"/>
-              <w:left w:val="single" w:sz="8" w:space="0" w:color="000000"/>
-              <w:bottom w:val="single" w:sz="8" w:space="0" w:color="000000"/>
-              <w:right w:val="single" w:sz="8" w:space="0" w:color="000000"/>
+              <w:top w:val="single" w:color="000000" w:sz="8" w:space="0"/>
+              <w:left w:val="single" w:color="000000" w:sz="8" w:space="0"/>
+              <w:bottom w:val="single" w:color="000000" w:sz="8" w:space="0"/>
+              <w:right w:val="single" w:color="000000" w:sz="8" w:space="0"/>
             </w:tcBorders>
             <w:shd w:val="clear" w:color="auto" w:fill="C0C0C0"/>
           </w:tcPr>
@@ -2795,10 +2833,10 @@
           <w:tcPr>
             <w:tcW w:w="2000" w:type="pct"/>
             <w:tcBorders>
-              <w:top w:val="single" w:sz="8" w:space="0" w:color="000000"/>
-              <w:left w:val="single" w:sz="8" w:space="0" w:color="000000"/>
-              <w:bottom w:val="single" w:sz="8" w:space="0" w:color="000000"/>
-              <w:right w:val="single" w:sz="8" w:space="0" w:color="000000"/>
+              <w:top w:val="single" w:color="000000" w:sz="8" w:space="0"/>
+              <w:left w:val="single" w:color="000000" w:sz="8" w:space="0"/>
+              <w:bottom w:val="single" w:color="000000" w:sz="8" w:space="0"/>
+              <w:right w:val="single" w:color="000000" w:sz="8" w:space="0"/>
             </w:tcBorders>
             <w:shd w:val="clear" w:color="000000" w:fill="C0C0C0"/>
           </w:tcPr>
@@ -2815,10 +2853,10 @@
           <w:tcPr>
             <w:tcW w:w="2000" w:type="pct"/>
             <w:tcBorders>
-              <w:top w:val="single" w:sz="8" w:space="0" w:color="000000"/>
-              <w:left w:val="single" w:sz="8" w:space="0" w:color="000000"/>
-              <w:bottom w:val="single" w:sz="8" w:space="0" w:color="000000"/>
-              <w:right w:val="single" w:sz="8" w:space="0" w:color="000000"/>
+              <w:top w:val="single" w:color="000000" w:sz="8" w:space="0"/>
+              <w:left w:val="single" w:color="000000" w:sz="8" w:space="0"/>
+              <w:bottom w:val="single" w:color="000000" w:sz="8" w:space="0"/>
+              <w:right w:val="single" w:color="000000" w:sz="8" w:space="0"/>
             </w:tcBorders>
             <w:shd w:val="clear" w:color="000000" w:fill="C0C0C0"/>
           </w:tcPr>
@@ -2840,10 +2878,10 @@
           <w:tcPr>
             <w:tcW w:w="1000" w:type="pct"/>
             <w:tcBorders>
-              <w:top w:val="single" w:sz="8" w:space="0" w:color="000000"/>
-              <w:left w:val="single" w:sz="8" w:space="0" w:color="000000"/>
-              <w:bottom w:val="single" w:sz="8" w:space="0" w:color="000000"/>
-              <w:right w:val="single" w:sz="8" w:space="0" w:color="000000"/>
+              <w:top w:val="single" w:color="000000" w:sz="8" w:space="0"/>
+              <w:left w:val="single" w:color="000000" w:sz="8" w:space="0"/>
+              <w:bottom w:val="single" w:color="000000" w:sz="8" w:space="0"/>
+              <w:right w:val="single" w:color="000000" w:sz="8" w:space="0"/>
             </w:tcBorders>
             <w:shd w:val="clear" w:color="auto" w:fill="C0C0C0"/>
           </w:tcPr>
@@ -2860,10 +2898,10 @@
           <w:tcPr>
             <w:tcW w:w="2000" w:type="pct"/>
             <w:tcBorders>
-              <w:top w:val="single" w:sz="8" w:space="0" w:color="000000"/>
-              <w:left w:val="single" w:sz="8" w:space="0" w:color="000000"/>
-              <w:bottom w:val="single" w:sz="8" w:space="0" w:color="000000"/>
-              <w:right w:val="single" w:sz="8" w:space="0" w:color="000000"/>
+              <w:top w:val="single" w:color="000000" w:sz="8" w:space="0"/>
+              <w:left w:val="single" w:color="000000" w:sz="8" w:space="0"/>
+              <w:bottom w:val="single" w:color="000000" w:sz="8" w:space="0"/>
+              <w:right w:val="single" w:color="000000" w:sz="8" w:space="0"/>
             </w:tcBorders>
             <w:shd w:val="clear" w:color="000000" w:fill="FFFFFF"/>
           </w:tcPr>
@@ -2880,10 +2918,10 @@
           <w:tcPr>
             <w:tcW w:w="2000" w:type="pct"/>
             <w:tcBorders>
-              <w:top w:val="single" w:sz="8" w:space="0" w:color="000000"/>
-              <w:left w:val="single" w:sz="8" w:space="0" w:color="000000"/>
-              <w:bottom w:val="single" w:sz="8" w:space="0" w:color="000000"/>
-              <w:right w:val="single" w:sz="8" w:space="0" w:color="000000"/>
+              <w:top w:val="single" w:color="000000" w:sz="8" w:space="0"/>
+              <w:left w:val="single" w:color="000000" w:sz="8" w:space="0"/>
+              <w:bottom w:val="single" w:color="000000" w:sz="8" w:space="0"/>
+              <w:right w:val="single" w:color="000000" w:sz="8" w:space="0"/>
             </w:tcBorders>
             <w:shd w:val="clear" w:color="000000" w:fill="FFFFFF"/>
           </w:tcPr>
@@ -2905,10 +2943,10 @@
           <w:tcPr>
             <w:tcW w:w="1000" w:type="pct"/>
             <w:tcBorders>
-              <w:top w:val="single" w:sz="8" w:space="0" w:color="000000"/>
-              <w:left w:val="single" w:sz="8" w:space="0" w:color="000000"/>
-              <w:bottom w:val="single" w:sz="8" w:space="0" w:color="000000"/>
-              <w:right w:val="single" w:sz="8" w:space="0" w:color="000000"/>
+              <w:top w:val="single" w:color="000000" w:sz="8" w:space="0"/>
+              <w:left w:val="single" w:color="000000" w:sz="8" w:space="0"/>
+              <w:bottom w:val="single" w:color="000000" w:sz="8" w:space="0"/>
+              <w:right w:val="single" w:color="000000" w:sz="8" w:space="0"/>
             </w:tcBorders>
             <w:shd w:val="clear" w:color="auto" w:fill="C0C0C0"/>
           </w:tcPr>
@@ -2925,10 +2963,10 @@
           <w:tcPr>
             <w:tcW w:w="2000" w:type="pct"/>
             <w:tcBorders>
-              <w:top w:val="single" w:sz="8" w:space="0" w:color="000000"/>
-              <w:left w:val="single" w:sz="8" w:space="0" w:color="000000"/>
-              <w:bottom w:val="single" w:sz="8" w:space="0" w:color="000000"/>
-              <w:right w:val="single" w:sz="8" w:space="0" w:color="000000"/>
+              <w:top w:val="single" w:color="000000" w:sz="8" w:space="0"/>
+              <w:left w:val="single" w:color="000000" w:sz="8" w:space="0"/>
+              <w:bottom w:val="single" w:color="000000" w:sz="8" w:space="0"/>
+              <w:right w:val="single" w:color="000000" w:sz="8" w:space="0"/>
             </w:tcBorders>
             <w:shd w:val="clear" w:color="000000" w:fill="FFFFFF"/>
           </w:tcPr>
@@ -2951,10 +2989,10 @@
           <w:tcPr>
             <w:tcW w:w="2000" w:type="pct"/>
             <w:tcBorders>
-              <w:top w:val="single" w:sz="8" w:space="0" w:color="000000"/>
-              <w:left w:val="single" w:sz="8" w:space="0" w:color="000000"/>
-              <w:bottom w:val="single" w:sz="8" w:space="0" w:color="000000"/>
-              <w:right w:val="single" w:sz="8" w:space="0" w:color="000000"/>
+              <w:top w:val="single" w:color="000000" w:sz="8" w:space="0"/>
+              <w:left w:val="single" w:color="000000" w:sz="8" w:space="0"/>
+              <w:bottom w:val="single" w:color="000000" w:sz="8" w:space="0"/>
+              <w:right w:val="single" w:color="000000" w:sz="8" w:space="0"/>
             </w:tcBorders>
             <w:shd w:val="clear" w:color="000000" w:fill="FFFFFF"/>
           </w:tcPr>
@@ -2982,10 +3020,10 @@
           <w:tcPr>
             <w:tcW w:w="1000" w:type="pct"/>
             <w:tcBorders>
-              <w:top w:val="single" w:sz="8" w:space="0" w:color="000000"/>
-              <w:left w:val="single" w:sz="8" w:space="0" w:color="000000"/>
-              <w:bottom w:val="single" w:sz="8" w:space="0" w:color="000000"/>
-              <w:right w:val="single" w:sz="8" w:space="0" w:color="000000"/>
+              <w:top w:val="single" w:color="000000" w:sz="8" w:space="0"/>
+              <w:left w:val="single" w:color="000000" w:sz="8" w:space="0"/>
+              <w:bottom w:val="single" w:color="000000" w:sz="8" w:space="0"/>
+              <w:right w:val="single" w:color="000000" w:sz="8" w:space="0"/>
             </w:tcBorders>
             <w:shd w:val="clear" w:color="auto" w:fill="C0C0C0"/>
           </w:tcPr>
@@ -2994,7 +3032,6 @@
               <w:pStyle w:val="CNTableTextBold"/>
             </w:pPr>
             <w:r>
-              <w:lastRenderedPageBreak/>
               <w:t>Address</w:t>
             </w:r>
           </w:p>
@@ -3003,10 +3040,10 @@
           <w:tcPr>
             <w:tcW w:w="2000" w:type="pct"/>
             <w:tcBorders>
-              <w:top w:val="single" w:sz="8" w:space="0" w:color="000000"/>
-              <w:left w:val="single" w:sz="8" w:space="0" w:color="000000"/>
-              <w:bottom w:val="single" w:sz="8" w:space="0" w:color="000000"/>
-              <w:right w:val="single" w:sz="8" w:space="0" w:color="000000"/>
+              <w:top w:val="single" w:color="000000" w:sz="8" w:space="0"/>
+              <w:left w:val="single" w:color="000000" w:sz="8" w:space="0"/>
+              <w:bottom w:val="single" w:color="000000" w:sz="8" w:space="0"/>
+              <w:right w:val="single" w:color="000000" w:sz="8" w:space="0"/>
             </w:tcBorders>
             <w:shd w:val="clear" w:color="000000" w:fill="FFFFFF"/>
           </w:tcPr>
@@ -3029,10 +3066,10 @@
           <w:tcPr>
             <w:tcW w:w="2000" w:type="pct"/>
             <w:tcBorders>
-              <w:top w:val="single" w:sz="8" w:space="0" w:color="000000"/>
-              <w:left w:val="single" w:sz="8" w:space="0" w:color="000000"/>
-              <w:bottom w:val="single" w:sz="8" w:space="0" w:color="000000"/>
-              <w:right w:val="single" w:sz="8" w:space="0" w:color="000000"/>
+              <w:top w:val="single" w:color="000000" w:sz="8" w:space="0"/>
+              <w:left w:val="single" w:color="000000" w:sz="8" w:space="0"/>
+              <w:bottom w:val="single" w:color="000000" w:sz="8" w:space="0"/>
+              <w:right w:val="single" w:color="000000" w:sz="8" w:space="0"/>
             </w:tcBorders>
             <w:shd w:val="clear" w:color="000000" w:fill="FFFFFF"/>
           </w:tcPr>
@@ -3060,10 +3097,10 @@
           <w:tcPr>
             <w:tcW w:w="1000" w:type="pct"/>
             <w:tcBorders>
-              <w:top w:val="single" w:sz="8" w:space="0" w:color="000000"/>
-              <w:left w:val="single" w:sz="8" w:space="0" w:color="000000"/>
-              <w:bottom w:val="single" w:sz="8" w:space="0" w:color="000000"/>
-              <w:right w:val="single" w:sz="8" w:space="0" w:color="000000"/>
+              <w:top w:val="single" w:color="000000" w:sz="8" w:space="0"/>
+              <w:left w:val="single" w:color="000000" w:sz="8" w:space="0"/>
+              <w:bottom w:val="single" w:color="000000" w:sz="8" w:space="0"/>
+              <w:right w:val="single" w:color="000000" w:sz="8" w:space="0"/>
             </w:tcBorders>
             <w:shd w:val="clear" w:color="auto" w:fill="C0C0C0"/>
           </w:tcPr>
@@ -3077,10 +3114,10 @@
           <w:tcPr>
             <w:tcW w:w="2000" w:type="pct"/>
             <w:tcBorders>
-              <w:top w:val="single" w:sz="8" w:space="0" w:color="000000"/>
-              <w:left w:val="single" w:sz="8" w:space="0" w:color="000000"/>
-              <w:bottom w:val="single" w:sz="8" w:space="0" w:color="000000"/>
-              <w:right w:val="single" w:sz="8" w:space="0" w:color="000000"/>
+              <w:top w:val="single" w:color="000000" w:sz="8" w:space="0"/>
+              <w:left w:val="single" w:color="000000" w:sz="8" w:space="0"/>
+              <w:bottom w:val="single" w:color="000000" w:sz="8" w:space="0"/>
+              <w:right w:val="single" w:color="000000" w:sz="8" w:space="0"/>
             </w:tcBorders>
             <w:shd w:val="clear" w:color="000000" w:fill="FFFFFF"/>
           </w:tcPr>
@@ -3117,10 +3154,10 @@
           <w:tcPr>
             <w:tcW w:w="2000" w:type="pct"/>
             <w:tcBorders>
-              <w:top w:val="single" w:sz="8" w:space="0" w:color="000000"/>
-              <w:left w:val="single" w:sz="8" w:space="0" w:color="000000"/>
-              <w:bottom w:val="single" w:sz="8" w:space="0" w:color="000000"/>
-              <w:right w:val="single" w:sz="8" w:space="0" w:color="000000"/>
+              <w:top w:val="single" w:color="000000" w:sz="8" w:space="0"/>
+              <w:left w:val="single" w:color="000000" w:sz="8" w:space="0"/>
+              <w:bottom w:val="single" w:color="000000" w:sz="8" w:space="0"/>
+              <w:right w:val="single" w:color="000000" w:sz="8" w:space="0"/>
             </w:tcBorders>
             <w:shd w:val="clear" w:color="000000" w:fill="FFFFFF"/>
           </w:tcPr>
@@ -3139,10 +3176,10 @@
           <w:tcPr>
             <w:tcW w:w="1000" w:type="pct"/>
             <w:tcBorders>
-              <w:top w:val="single" w:sz="8" w:space="0" w:color="000000"/>
-              <w:left w:val="single" w:sz="8" w:space="0" w:color="000000"/>
-              <w:bottom w:val="single" w:sz="8" w:space="0" w:color="000000"/>
-              <w:right w:val="single" w:sz="8" w:space="0" w:color="000000"/>
+              <w:top w:val="single" w:color="000000" w:sz="8" w:space="0"/>
+              <w:left w:val="single" w:color="000000" w:sz="8" w:space="0"/>
+              <w:bottom w:val="single" w:color="000000" w:sz="8" w:space="0"/>
+              <w:right w:val="single" w:color="000000" w:sz="8" w:space="0"/>
             </w:tcBorders>
             <w:shd w:val="clear" w:color="auto" w:fill="C0C0C0"/>
           </w:tcPr>
@@ -3159,10 +3196,10 @@
           <w:tcPr>
             <w:tcW w:w="2000" w:type="pct"/>
             <w:tcBorders>
-              <w:top w:val="single" w:sz="8" w:space="0" w:color="000000"/>
-              <w:left w:val="single" w:sz="8" w:space="0" w:color="000000"/>
-              <w:bottom w:val="single" w:sz="8" w:space="0" w:color="000000"/>
-              <w:right w:val="single" w:sz="8" w:space="0" w:color="000000"/>
+              <w:top w:val="single" w:color="000000" w:sz="8" w:space="0"/>
+              <w:left w:val="single" w:color="000000" w:sz="8" w:space="0"/>
+              <w:bottom w:val="single" w:color="000000" w:sz="8" w:space="0"/>
+              <w:right w:val="single" w:color="000000" w:sz="8" w:space="0"/>
             </w:tcBorders>
             <w:shd w:val="clear" w:color="000000" w:fill="FFFFFF"/>
           </w:tcPr>
@@ -3182,10 +3219,10 @@
           <w:tcPr>
             <w:tcW w:w="2000" w:type="pct"/>
             <w:tcBorders>
-              <w:top w:val="single" w:sz="8" w:space="0" w:color="000000"/>
-              <w:left w:val="single" w:sz="8" w:space="0" w:color="000000"/>
-              <w:bottom w:val="single" w:sz="8" w:space="0" w:color="000000"/>
-              <w:right w:val="single" w:sz="8" w:space="0" w:color="000000"/>
+              <w:top w:val="single" w:color="000000" w:sz="8" w:space="0"/>
+              <w:left w:val="single" w:color="000000" w:sz="8" w:space="0"/>
+              <w:bottom w:val="single" w:color="000000" w:sz="8" w:space="0"/>
+              <w:right w:val="single" w:color="000000" w:sz="8" w:space="0"/>
             </w:tcBorders>
             <w:shd w:val="clear" w:color="000000" w:fill="FFFFFF"/>
           </w:tcPr>
@@ -3232,10 +3269,10 @@
           <w:tcPr>
             <w:tcW w:w="1000" w:type="pct"/>
             <w:tcBorders>
-              <w:top w:val="single" w:sz="8" w:space="0" w:color="000000"/>
-              <w:left w:val="single" w:sz="8" w:space="0" w:color="000000"/>
-              <w:bottom w:val="single" w:sz="8" w:space="0" w:color="000000"/>
-              <w:right w:val="single" w:sz="8" w:space="0" w:color="000000"/>
+              <w:top w:val="single" w:color="000000" w:sz="8" w:space="0"/>
+              <w:left w:val="single" w:color="000000" w:sz="8" w:space="0"/>
+              <w:bottom w:val="single" w:color="000000" w:sz="8" w:space="0"/>
+              <w:right w:val="single" w:color="000000" w:sz="8" w:space="0"/>
             </w:tcBorders>
             <w:shd w:val="clear" w:color="auto" w:fill="C0C0C0"/>
           </w:tcPr>
@@ -3252,10 +3289,10 @@
           <w:tcPr>
             <w:tcW w:w="2000" w:type="pct"/>
             <w:tcBorders>
-              <w:top w:val="single" w:sz="8" w:space="0" w:color="000000"/>
-              <w:left w:val="single" w:sz="8" w:space="0" w:color="000000"/>
-              <w:bottom w:val="single" w:sz="8" w:space="0" w:color="000000"/>
-              <w:right w:val="single" w:sz="8" w:space="0" w:color="000000"/>
+              <w:top w:val="single" w:color="000000" w:sz="8" w:space="0"/>
+              <w:left w:val="single" w:color="000000" w:sz="8" w:space="0"/>
+              <w:bottom w:val="single" w:color="000000" w:sz="8" w:space="0"/>
+              <w:right w:val="single" w:color="000000" w:sz="8" w:space="0"/>
             </w:tcBorders>
             <w:shd w:val="clear" w:color="000000" w:fill="FFFFFF"/>
           </w:tcPr>
@@ -3269,10 +3306,10 @@
           <w:tcPr>
             <w:tcW w:w="2000" w:type="pct"/>
             <w:tcBorders>
-              <w:top w:val="single" w:sz="8" w:space="0" w:color="000000"/>
-              <w:left w:val="single" w:sz="8" w:space="0" w:color="000000"/>
-              <w:bottom w:val="single" w:sz="8" w:space="0" w:color="000000"/>
-              <w:right w:val="single" w:sz="8" w:space="0" w:color="000000"/>
+              <w:top w:val="single" w:color="000000" w:sz="8" w:space="0"/>
+              <w:left w:val="single" w:color="000000" w:sz="8" w:space="0"/>
+              <w:bottom w:val="single" w:color="000000" w:sz="8" w:space="0"/>
+              <w:right w:val="single" w:color="000000" w:sz="8" w:space="0"/>
             </w:tcBorders>
             <w:shd w:val="clear" w:color="000000" w:fill="FFFFFF"/>
           </w:tcPr>
@@ -3291,10 +3328,10 @@
           <w:tcPr>
             <w:tcW w:w="1000" w:type="pct"/>
             <w:tcBorders>
-              <w:top w:val="single" w:sz="8" w:space="0" w:color="000000"/>
-              <w:left w:val="single" w:sz="8" w:space="0" w:color="000000"/>
-              <w:bottom w:val="single" w:sz="8" w:space="0" w:color="000000"/>
-              <w:right w:val="single" w:sz="8" w:space="0" w:color="000000"/>
+              <w:top w:val="single" w:color="000000" w:sz="8" w:space="0"/>
+              <w:left w:val="single" w:color="000000" w:sz="8" w:space="0"/>
+              <w:bottom w:val="single" w:color="000000" w:sz="8" w:space="0"/>
+              <w:right w:val="single" w:color="000000" w:sz="8" w:space="0"/>
             </w:tcBorders>
             <w:shd w:val="clear" w:color="auto" w:fill="C0C0C0"/>
           </w:tcPr>
@@ -3311,10 +3348,10 @@
           <w:tcPr>
             <w:tcW w:w="2000" w:type="pct"/>
             <w:tcBorders>
-              <w:top w:val="single" w:sz="8" w:space="0" w:color="000000"/>
-              <w:left w:val="single" w:sz="8" w:space="0" w:color="000000"/>
-              <w:bottom w:val="single" w:sz="8" w:space="0" w:color="000000"/>
-              <w:right w:val="single" w:sz="8" w:space="0" w:color="000000"/>
+              <w:top w:val="single" w:color="000000" w:sz="8" w:space="0"/>
+              <w:left w:val="single" w:color="000000" w:sz="8" w:space="0"/>
+              <w:bottom w:val="single" w:color="000000" w:sz="8" w:space="0"/>
+              <w:right w:val="single" w:color="000000" w:sz="8" w:space="0"/>
             </w:tcBorders>
             <w:shd w:val="clear" w:color="000000" w:fill="FFFFFF"/>
           </w:tcPr>
@@ -3328,10 +3365,10 @@
           <w:tcPr>
             <w:tcW w:w="2000" w:type="pct"/>
             <w:tcBorders>
-              <w:top w:val="single" w:sz="8" w:space="0" w:color="000000"/>
-              <w:left w:val="single" w:sz="8" w:space="0" w:color="000000"/>
-              <w:bottom w:val="single" w:sz="8" w:space="0" w:color="000000"/>
-              <w:right w:val="single" w:sz="8" w:space="0" w:color="000000"/>
+              <w:top w:val="single" w:color="000000" w:sz="8" w:space="0"/>
+              <w:left w:val="single" w:color="000000" w:sz="8" w:space="0"/>
+              <w:bottom w:val="single" w:color="000000" w:sz="8" w:space="0"/>
+              <w:right w:val="single" w:color="000000" w:sz="8" w:space="0"/>
             </w:tcBorders>
             <w:shd w:val="clear" w:color="000000" w:fill="FFFFFF"/>
           </w:tcPr>
@@ -3350,10 +3387,10 @@
           <w:tcPr>
             <w:tcW w:w="1000" w:type="pct"/>
             <w:tcBorders>
-              <w:top w:val="single" w:sz="8" w:space="0" w:color="000000"/>
-              <w:left w:val="single" w:sz="8" w:space="0" w:color="000000"/>
-              <w:bottom w:val="single" w:sz="8" w:space="0" w:color="000000"/>
-              <w:right w:val="single" w:sz="8" w:space="0" w:color="000000"/>
+              <w:top w:val="single" w:color="000000" w:sz="8" w:space="0"/>
+              <w:left w:val="single" w:color="000000" w:sz="8" w:space="0"/>
+              <w:bottom w:val="single" w:color="000000" w:sz="8" w:space="0"/>
+              <w:right w:val="single" w:color="000000" w:sz="8" w:space="0"/>
             </w:tcBorders>
             <w:shd w:val="clear" w:color="auto" w:fill="C0C0C0"/>
           </w:tcPr>
@@ -3370,10 +3407,10 @@
           <w:tcPr>
             <w:tcW w:w="2000" w:type="pct"/>
             <w:tcBorders>
-              <w:top w:val="single" w:sz="8" w:space="0" w:color="000000"/>
-              <w:left w:val="single" w:sz="8" w:space="0" w:color="000000"/>
-              <w:bottom w:val="single" w:sz="8" w:space="0" w:color="000000"/>
-              <w:right w:val="single" w:sz="8" w:space="0" w:color="000000"/>
+              <w:top w:val="single" w:color="000000" w:sz="8" w:space="0"/>
+              <w:left w:val="single" w:color="000000" w:sz="8" w:space="0"/>
+              <w:bottom w:val="single" w:color="000000" w:sz="8" w:space="0"/>
+              <w:right w:val="single" w:color="000000" w:sz="8" w:space="0"/>
             </w:tcBorders>
             <w:shd w:val="clear" w:color="000000" w:fill="FFFFFF"/>
           </w:tcPr>
@@ -3390,10 +3427,10 @@
           <w:tcPr>
             <w:tcW w:w="2000" w:type="pct"/>
             <w:tcBorders>
-              <w:top w:val="single" w:sz="8" w:space="0" w:color="000000"/>
-              <w:left w:val="single" w:sz="8" w:space="0" w:color="000000"/>
-              <w:bottom w:val="single" w:sz="8" w:space="0" w:color="000000"/>
-              <w:right w:val="single" w:sz="8" w:space="0" w:color="000000"/>
+              <w:top w:val="single" w:color="000000" w:sz="8" w:space="0"/>
+              <w:left w:val="single" w:color="000000" w:sz="8" w:space="0"/>
+              <w:bottom w:val="single" w:color="000000" w:sz="8" w:space="0"/>
+              <w:right w:val="single" w:color="000000" w:sz="8" w:space="0"/>
             </w:tcBorders>
             <w:shd w:val="clear" w:color="000000" w:fill="FFFFFF"/>
           </w:tcPr>
@@ -3430,7 +3467,7 @@
     <w:sectPr>
       <w:headerReference w:type="default" r:id="rId15"/>
       <w:footerReference w:type="default" r:id="rId16"/>
-      <w:pgSz w:w="12240" w:h="15840" w:code="1"/>
+      <w:pgSz w:w="12240" w:h="15840" w:orient="portrait" w:code="1"/>
       <w:pgMar w:top="1080" w:right="1080" w:bottom="1080" w:left="1080" w:header="720" w:footer="720" w:gutter="0"/>
       <w:cols w:space="720"/>
       <w:docGrid w:linePitch="360"/>
@@ -3490,10 +3527,14 @@
     </w:r>
     <w:r>
       <w:tab/>
+    </w:r>
+    <w:r>
       <w:t>IBM Confidential</w:t>
     </w:r>
     <w:r>
       <w:tab/>
+    </w:r>
+    <w:r>
       <w:t xml:space="preserve">Page </w:t>
     </w:r>
     <w:r>
@@ -3900,11 +3941,11 @@
 </file>
 
 <file path=word/styles.xml><?xml version="1.0" encoding="utf-8"?>
-<w:styles xmlns:mc="http://schemas.openxmlformats.org/markup-compatibility/2006" xmlns:r="http://schemas.openxmlformats.org/officeDocument/2006/relationships" xmlns:w="http://schemas.openxmlformats.org/wordprocessingml/2006/main" xmlns:w14="http://schemas.microsoft.com/office/word/2010/wordml" xmlns:w15="http://schemas.microsoft.com/office/word/2012/wordml" xmlns:w16cex="http://schemas.microsoft.com/office/word/2018/wordml/cex" xmlns:w16cid="http://schemas.microsoft.com/office/word/2016/wordml/cid" xmlns:w16="http://schemas.microsoft.com/office/word/2018/wordml" xmlns:w16du="http://schemas.microsoft.com/office/word/2023/wordml/word16du" xmlns:w16sdtdh="http://schemas.microsoft.com/office/word/2020/wordml/sdtdatahash" xmlns:w16sdtfl="http://schemas.microsoft.com/office/word/2024/wordml/sdtformatlock" xmlns:w16se="http://schemas.microsoft.com/office/word/2015/wordml/symex" mc:Ignorable="w14 w15 w16se w16cid w16 w16cex w16sdtdh w16sdtfl w16du">
+<w:styles xmlns:wp14="http://schemas.microsoft.com/office/word/2010/wordprocessingDrawing" xmlns:mc="http://schemas.openxmlformats.org/markup-compatibility/2006" xmlns:r="http://schemas.openxmlformats.org/officeDocument/2006/relationships" xmlns:w="http://schemas.openxmlformats.org/wordprocessingml/2006/main" xmlns:w14="http://schemas.microsoft.com/office/word/2010/wordml" xmlns:w15="http://schemas.microsoft.com/office/word/2012/wordml" xmlns:w16cex="http://schemas.microsoft.com/office/word/2018/wordml/cex" xmlns:w16cid="http://schemas.microsoft.com/office/word/2016/wordml/cid" xmlns:w16="http://schemas.microsoft.com/office/word/2018/wordml" xmlns:w16du="http://schemas.microsoft.com/office/word/2023/wordml/word16du" xmlns:w16sdtdh="http://schemas.microsoft.com/office/word/2020/wordml/sdtdatahash" xmlns:w16sdtfl="http://schemas.microsoft.com/office/word/2024/wordml/sdtformatlock" xmlns:w16se="http://schemas.microsoft.com/office/word/2015/wordml/symex" mc:Ignorable="w14 w15 w16se w16cid w16 w16cex w16sdtdh w16sdtfl w16du wp14">
   <w:docDefaults>
     <w:rPrDefault>
       <w:rPr>
-        <w:rFonts w:asciiTheme="minorHAnsi" w:eastAsiaTheme="minorHAnsi" w:hAnsiTheme="minorHAnsi" w:cstheme="minorBidi"/>
+        <w:rFonts w:asciiTheme="minorHAnsi" w:hAnsiTheme="minorHAnsi" w:eastAsiaTheme="minorHAnsi" w:cstheme="minorBidi"/>
         <w:kern w:val="2"/>
         <w:sz w:val="24"/>
         <w:szCs w:val="24"/>
@@ -3921,14 +3962,14 @@
   <w:latentStyles w:defLockedState="0" w:defUIPriority="99" w:defSemiHidden="0" w:defUnhideWhenUsed="0" w:defQFormat="0" w:count="376">
     <w:lsdException w:name="Normal" w:uiPriority="0" w:qFormat="1"/>
     <w:lsdException w:name="heading 1" w:uiPriority="9" w:qFormat="1"/>
-    <w:lsdException w:name="heading 2" w:semiHidden="1" w:uiPriority="9" w:unhideWhenUsed="1" w:qFormat="1"/>
-    <w:lsdException w:name="heading 3" w:semiHidden="1" w:uiPriority="9" w:unhideWhenUsed="1" w:qFormat="1"/>
-    <w:lsdException w:name="heading 4" w:semiHidden="1" w:uiPriority="9" w:unhideWhenUsed="1" w:qFormat="1"/>
-    <w:lsdException w:name="heading 5" w:semiHidden="1" w:uiPriority="9" w:unhideWhenUsed="1" w:qFormat="1"/>
-    <w:lsdException w:name="heading 6" w:semiHidden="1" w:uiPriority="9" w:unhideWhenUsed="1" w:qFormat="1"/>
-    <w:lsdException w:name="heading 7" w:semiHidden="1" w:uiPriority="9" w:unhideWhenUsed="1" w:qFormat="1"/>
-    <w:lsdException w:name="heading 8" w:semiHidden="1" w:uiPriority="9" w:unhideWhenUsed="1" w:qFormat="1"/>
-    <w:lsdException w:name="heading 9" w:semiHidden="1" w:uiPriority="9" w:unhideWhenUsed="1" w:qFormat="1"/>
+    <w:lsdException w:name="heading 2" w:uiPriority="9" w:semiHidden="1" w:unhideWhenUsed="1" w:qFormat="1"/>
+    <w:lsdException w:name="heading 3" w:uiPriority="9" w:semiHidden="1" w:unhideWhenUsed="1" w:qFormat="1"/>
+    <w:lsdException w:name="heading 4" w:uiPriority="9" w:semiHidden="1" w:unhideWhenUsed="1" w:qFormat="1"/>
+    <w:lsdException w:name="heading 5" w:uiPriority="9" w:semiHidden="1" w:unhideWhenUsed="1" w:qFormat="1"/>
+    <w:lsdException w:name="heading 6" w:uiPriority="9" w:semiHidden="1" w:unhideWhenUsed="1" w:qFormat="1"/>
+    <w:lsdException w:name="heading 7" w:uiPriority="9" w:semiHidden="1" w:unhideWhenUsed="1" w:qFormat="1"/>
+    <w:lsdException w:name="heading 8" w:uiPriority="9" w:semiHidden="1" w:unhideWhenUsed="1" w:qFormat="1"/>
+    <w:lsdException w:name="heading 9" w:uiPriority="9" w:semiHidden="1" w:unhideWhenUsed="1" w:qFormat="1"/>
     <w:lsdException w:name="index 1" w:semiHidden="1" w:unhideWhenUsed="1"/>
     <w:lsdException w:name="index 2" w:semiHidden="1" w:unhideWhenUsed="1"/>
     <w:lsdException w:name="index 3" w:semiHidden="1" w:unhideWhenUsed="1"/>
@@ -3938,22 +3979,22 @@
     <w:lsdException w:name="index 7" w:semiHidden="1" w:unhideWhenUsed="1"/>
     <w:lsdException w:name="index 8" w:semiHidden="1" w:unhideWhenUsed="1"/>
     <w:lsdException w:name="index 9" w:semiHidden="1" w:unhideWhenUsed="1"/>
-    <w:lsdException w:name="toc 1" w:semiHidden="1" w:uiPriority="39" w:unhideWhenUsed="1"/>
-    <w:lsdException w:name="toc 2" w:semiHidden="1" w:uiPriority="39" w:unhideWhenUsed="1"/>
-    <w:lsdException w:name="toc 3" w:semiHidden="1" w:uiPriority="39" w:unhideWhenUsed="1"/>
-    <w:lsdException w:name="toc 4" w:semiHidden="1" w:uiPriority="39" w:unhideWhenUsed="1"/>
-    <w:lsdException w:name="toc 5" w:semiHidden="1" w:uiPriority="39" w:unhideWhenUsed="1"/>
-    <w:lsdException w:name="toc 6" w:semiHidden="1" w:uiPriority="39" w:unhideWhenUsed="1"/>
-    <w:lsdException w:name="toc 7" w:semiHidden="1" w:uiPriority="39" w:unhideWhenUsed="1"/>
-    <w:lsdException w:name="toc 8" w:semiHidden="1" w:uiPriority="39" w:unhideWhenUsed="1"/>
-    <w:lsdException w:name="toc 9" w:semiHidden="1" w:uiPriority="39" w:unhideWhenUsed="1"/>
+    <w:lsdException w:name="toc 1" w:uiPriority="39" w:semiHidden="1" w:unhideWhenUsed="1"/>
+    <w:lsdException w:name="toc 2" w:uiPriority="39" w:semiHidden="1" w:unhideWhenUsed="1"/>
+    <w:lsdException w:name="toc 3" w:uiPriority="39" w:semiHidden="1" w:unhideWhenUsed="1"/>
+    <w:lsdException w:name="toc 4" w:uiPriority="39" w:semiHidden="1" w:unhideWhenUsed="1"/>
+    <w:lsdException w:name="toc 5" w:uiPriority="39" w:semiHidden="1" w:unhideWhenUsed="1"/>
+    <w:lsdException w:name="toc 6" w:uiPriority="39" w:semiHidden="1" w:unhideWhenUsed="1"/>
+    <w:lsdException w:name="toc 7" w:uiPriority="39" w:semiHidden="1" w:unhideWhenUsed="1"/>
+    <w:lsdException w:name="toc 8" w:uiPriority="39" w:semiHidden="1" w:unhideWhenUsed="1"/>
+    <w:lsdException w:name="toc 9" w:uiPriority="39" w:semiHidden="1" w:unhideWhenUsed="1"/>
     <w:lsdException w:name="Normal Indent" w:semiHidden="1" w:unhideWhenUsed="1"/>
     <w:lsdException w:name="footnote text" w:semiHidden="1" w:unhideWhenUsed="1"/>
     <w:lsdException w:name="annotation text" w:semiHidden="1" w:unhideWhenUsed="1"/>
-    <w:lsdException w:name="header" w:semiHidden="1" w:uiPriority="0" w:unhideWhenUsed="1"/>
+    <w:lsdException w:name="header" w:uiPriority="0" w:semiHidden="1" w:unhideWhenUsed="1"/>
     <w:lsdException w:name="footer" w:semiHidden="1" w:unhideWhenUsed="1"/>
     <w:lsdException w:name="index heading" w:semiHidden="1" w:unhideWhenUsed="1"/>
-    <w:lsdException w:name="caption" w:semiHidden="1" w:uiPriority="35" w:unhideWhenUsed="1" w:qFormat="1"/>
+    <w:lsdException w:name="caption" w:uiPriority="35" w:semiHidden="1" w:unhideWhenUsed="1" w:qFormat="1"/>
     <w:lsdException w:name="table of figures" w:semiHidden="1" w:unhideWhenUsed="1"/>
     <w:lsdException w:name="envelope address" w:semiHidden="1" w:unhideWhenUsed="1"/>
     <w:lsdException w:name="envelope return" w:semiHidden="1" w:unhideWhenUsed="1"/>
@@ -3984,7 +4025,7 @@
     <w:lsdException w:name="Title" w:uiPriority="10" w:qFormat="1"/>
     <w:lsdException w:name="Closing" w:semiHidden="1" w:unhideWhenUsed="1"/>
     <w:lsdException w:name="Signature" w:semiHidden="1" w:unhideWhenUsed="1"/>
-    <w:lsdException w:name="Default Paragraph Font" w:semiHidden="1" w:uiPriority="1" w:unhideWhenUsed="1"/>
+    <w:lsdException w:name="Default Paragraph Font" w:uiPriority="1" w:semiHidden="1" w:unhideWhenUsed="1"/>
     <w:lsdException w:name="Body Text" w:semiHidden="1" w:unhideWhenUsed="1"/>
     <w:lsdException w:name="Body Text Indent" w:semiHidden="1" w:unhideWhenUsed="1"/>
     <w:lsdException w:name="List Continue" w:semiHidden="1" w:unhideWhenUsed="1"/>
@@ -4004,7 +4045,7 @@
     <w:lsdException w:name="Body Text Indent 2" w:semiHidden="1" w:unhideWhenUsed="1"/>
     <w:lsdException w:name="Body Text Indent 3" w:semiHidden="1" w:unhideWhenUsed="1"/>
     <w:lsdException w:name="Block Text" w:semiHidden="1" w:unhideWhenUsed="1"/>
-    <w:lsdException w:name="Hyperlink" w:semiHidden="1" w:uiPriority="0" w:unhideWhenUsed="1"/>
+    <w:lsdException w:name="Hyperlink" w:uiPriority="0" w:semiHidden="1" w:unhideWhenUsed="1"/>
     <w:lsdException w:name="FollowedHyperlink" w:semiHidden="1" w:unhideWhenUsed="1"/>
     <w:lsdException w:name="Strong" w:uiPriority="22" w:qFormat="1"/>
     <w:lsdException w:name="Emphasis" w:uiPriority="20" w:qFormat="1"/>
@@ -4184,8 +4225,8 @@
     <w:lsdException w:name="Subtle Reference" w:uiPriority="31" w:qFormat="1"/>
     <w:lsdException w:name="Intense Reference" w:uiPriority="32" w:qFormat="1"/>
     <w:lsdException w:name="Book Title" w:uiPriority="33" w:qFormat="1"/>
-    <w:lsdException w:name="Bibliography" w:semiHidden="1" w:uiPriority="37" w:unhideWhenUsed="1"/>
-    <w:lsdException w:name="TOC Heading" w:semiHidden="1" w:uiPriority="39" w:unhideWhenUsed="1" w:qFormat="1"/>
+    <w:lsdException w:name="Bibliography" w:uiPriority="37" w:semiHidden="1" w:unhideWhenUsed="1"/>
+    <w:lsdException w:name="TOC Heading" w:uiPriority="39" w:semiHidden="1" w:unhideWhenUsed="1" w:qFormat="1"/>
     <w:lsdException w:name="Plain Table 1" w:uiPriority="41"/>
     <w:lsdException w:name="Plain Table 2" w:uiPriority="42"/>
     <w:lsdException w:name="Plain Table 3" w:uiPriority="43"/>
@@ -4296,7 +4337,7 @@
     <w:lsdException w:name="Unresolved Mention" w:semiHidden="1" w:unhideWhenUsed="1"/>
     <w:lsdException w:name="Smart Link" w:semiHidden="1" w:unhideWhenUsed="1"/>
   </w:latentStyles>
-  <w:style w:type="paragraph" w:default="1" w:styleId="Normal">
+  <w:style w:type="paragraph" w:styleId="Normal" w:default="1">
     <w:name w:val="Normal"/>
     <w:qFormat/>
     <w:rsid w:val="004C6ED6"/>
@@ -4304,7 +4345,7 @@
       <w:spacing w:after="0" w:line="240" w:lineRule="auto"/>
     </w:pPr>
     <w:rPr>
-      <w:rFonts w:ascii="Arial" w:eastAsia="Times New Roman" w:hAnsi="Arial" w:cs="Courier New"/>
+      <w:rFonts w:ascii="Arial" w:hAnsi="Arial" w:eastAsia="Times New Roman" w:cs="Courier New"/>
       <w:kern w:val="0"/>
       <w:sz w:val="20"/>
       <w:szCs w:val="20"/>
@@ -4327,7 +4368,7 @@
       <w:outlineLvl w:val="0"/>
     </w:pPr>
     <w:rPr>
-      <w:rFonts w:asciiTheme="majorHAnsi" w:eastAsiaTheme="majorEastAsia" w:hAnsiTheme="majorHAnsi" w:cstheme="majorBidi"/>
+      <w:rFonts w:asciiTheme="majorHAnsi" w:hAnsiTheme="majorHAnsi" w:eastAsiaTheme="majorEastAsia" w:cstheme="majorBidi"/>
       <w:color w:val="0F4761" w:themeColor="accent1" w:themeShade="BF"/>
       <w:sz w:val="40"/>
       <w:szCs w:val="40"/>
@@ -4350,7 +4391,7 @@
       <w:outlineLvl w:val="1"/>
     </w:pPr>
     <w:rPr>
-      <w:rFonts w:asciiTheme="majorHAnsi" w:eastAsiaTheme="majorEastAsia" w:hAnsiTheme="majorHAnsi" w:cstheme="majorBidi"/>
+      <w:rFonts w:asciiTheme="majorHAnsi" w:hAnsiTheme="majorHAnsi" w:eastAsiaTheme="majorEastAsia" w:cstheme="majorBidi"/>
       <w:color w:val="0F4761" w:themeColor="accent1" w:themeShade="BF"/>
       <w:sz w:val="32"/>
       <w:szCs w:val="32"/>
@@ -4509,13 +4550,13 @@
       <w:color w:val="272727" w:themeColor="text1" w:themeTint="D8"/>
     </w:rPr>
   </w:style>
-  <w:style w:type="character" w:default="1" w:styleId="DefaultParagraphFont">
+  <w:style w:type="character" w:styleId="DefaultParagraphFont" w:default="1">
     <w:name w:val="Default Paragraph Font"/>
     <w:uiPriority w:val="1"/>
     <w:semiHidden/>
     <w:unhideWhenUsed/>
   </w:style>
-  <w:style w:type="table" w:default="1" w:styleId="TableNormal">
+  <w:style w:type="table" w:styleId="TableNormal" w:default="1">
     <w:name w:val="Normal Table"/>
     <w:uiPriority w:val="99"/>
     <w:semiHidden/>
@@ -4530,26 +4571,26 @@
       </w:tblCellMar>
     </w:tblPr>
   </w:style>
-  <w:style w:type="numbering" w:default="1" w:styleId="NoList">
+  <w:style w:type="numbering" w:styleId="NoList" w:default="1">
     <w:name w:val="No List"/>
     <w:uiPriority w:val="99"/>
     <w:semiHidden/>
     <w:unhideWhenUsed/>
   </w:style>
-  <w:style w:type="character" w:customStyle="1" w:styleId="Heading1Char">
+  <w:style w:type="character" w:styleId="Heading1Char" w:customStyle="1">
     <w:name w:val="Heading 1 Char"/>
     <w:basedOn w:val="DefaultParagraphFont"/>
     <w:link w:val="Heading1"/>
     <w:uiPriority w:val="9"/>
     <w:rsid w:val="004C6ED6"/>
     <w:rPr>
-      <w:rFonts w:asciiTheme="majorHAnsi" w:eastAsiaTheme="majorEastAsia" w:hAnsiTheme="majorHAnsi" w:cstheme="majorBidi"/>
+      <w:rFonts w:asciiTheme="majorHAnsi" w:hAnsiTheme="majorHAnsi" w:eastAsiaTheme="majorEastAsia" w:cstheme="majorBidi"/>
       <w:color w:val="0F4761" w:themeColor="accent1" w:themeShade="BF"/>
       <w:sz w:val="40"/>
       <w:szCs w:val="40"/>
     </w:rPr>
   </w:style>
-  <w:style w:type="character" w:customStyle="1" w:styleId="Heading2Char">
+  <w:style w:type="character" w:styleId="Heading2Char" w:customStyle="1">
     <w:name w:val="Heading 2 Char"/>
     <w:basedOn w:val="DefaultParagraphFont"/>
     <w:link w:val="Heading2"/>
@@ -4557,13 +4598,13 @@
     <w:semiHidden/>
     <w:rsid w:val="004C6ED6"/>
     <w:rPr>
-      <w:rFonts w:asciiTheme="majorHAnsi" w:eastAsiaTheme="majorEastAsia" w:hAnsiTheme="majorHAnsi" w:cstheme="majorBidi"/>
+      <w:rFonts w:asciiTheme="majorHAnsi" w:hAnsiTheme="majorHAnsi" w:eastAsiaTheme="majorEastAsia" w:cstheme="majorBidi"/>
       <w:color w:val="0F4761" w:themeColor="accent1" w:themeShade="BF"/>
       <w:sz w:val="32"/>
       <w:szCs w:val="32"/>
     </w:rPr>
   </w:style>
-  <w:style w:type="character" w:customStyle="1" w:styleId="Heading3Char">
+  <w:style w:type="character" w:styleId="Heading3Char" w:customStyle="1">
     <w:name w:val="Heading 3 Char"/>
     <w:basedOn w:val="DefaultParagraphFont"/>
     <w:link w:val="Heading3"/>
@@ -4577,7 +4618,7 @@
       <w:szCs w:val="28"/>
     </w:rPr>
   </w:style>
-  <w:style w:type="character" w:customStyle="1" w:styleId="Heading4Char">
+  <w:style w:type="character" w:styleId="Heading4Char" w:customStyle="1">
     <w:name w:val="Heading 4 Char"/>
     <w:basedOn w:val="DefaultParagraphFont"/>
     <w:link w:val="Heading4"/>
@@ -4591,7 +4632,7 @@
       <w:color w:val="0F4761" w:themeColor="accent1" w:themeShade="BF"/>
     </w:rPr>
   </w:style>
-  <w:style w:type="character" w:customStyle="1" w:styleId="Heading5Char">
+  <w:style w:type="character" w:styleId="Heading5Char" w:customStyle="1">
     <w:name w:val="Heading 5 Char"/>
     <w:basedOn w:val="DefaultParagraphFont"/>
     <w:link w:val="Heading5"/>
@@ -4603,7 +4644,7 @@
       <w:color w:val="0F4761" w:themeColor="accent1" w:themeShade="BF"/>
     </w:rPr>
   </w:style>
-  <w:style w:type="character" w:customStyle="1" w:styleId="Heading6Char">
+  <w:style w:type="character" w:styleId="Heading6Char" w:customStyle="1">
     <w:name w:val="Heading 6 Char"/>
     <w:basedOn w:val="DefaultParagraphFont"/>
     <w:link w:val="Heading6"/>
@@ -4617,7 +4658,7 @@
       <w:color w:val="595959" w:themeColor="text1" w:themeTint="A6"/>
     </w:rPr>
   </w:style>
-  <w:style w:type="character" w:customStyle="1" w:styleId="Heading7Char">
+  <w:style w:type="character" w:styleId="Heading7Char" w:customStyle="1">
     <w:name w:val="Heading 7 Char"/>
     <w:basedOn w:val="DefaultParagraphFont"/>
     <w:link w:val="Heading7"/>
@@ -4629,7 +4670,7 @@
       <w:color w:val="595959" w:themeColor="text1" w:themeTint="A6"/>
     </w:rPr>
   </w:style>
-  <w:style w:type="character" w:customStyle="1" w:styleId="Heading8Char">
+  <w:style w:type="character" w:styleId="Heading8Char" w:customStyle="1">
     <w:name w:val="Heading 8 Char"/>
     <w:basedOn w:val="DefaultParagraphFont"/>
     <w:link w:val="Heading8"/>
@@ -4643,7 +4684,7 @@
       <w:color w:val="272727" w:themeColor="text1" w:themeTint="D8"/>
     </w:rPr>
   </w:style>
-  <w:style w:type="character" w:customStyle="1" w:styleId="Heading9Char">
+  <w:style w:type="character" w:styleId="Heading9Char" w:customStyle="1">
     <w:name w:val="Heading 9 Char"/>
     <w:basedOn w:val="DefaultParagraphFont"/>
     <w:link w:val="Heading9"/>
@@ -4668,21 +4709,21 @@
       <w:contextualSpacing/>
     </w:pPr>
     <w:rPr>
-      <w:rFonts w:asciiTheme="majorHAnsi" w:eastAsiaTheme="majorEastAsia" w:hAnsiTheme="majorHAnsi" w:cstheme="majorBidi"/>
+      <w:rFonts w:asciiTheme="majorHAnsi" w:hAnsiTheme="majorHAnsi" w:eastAsiaTheme="majorEastAsia" w:cstheme="majorBidi"/>
       <w:spacing w:val="-10"/>
       <w:kern w:val="28"/>
       <w:sz w:val="56"/>
       <w:szCs w:val="56"/>
     </w:rPr>
   </w:style>
-  <w:style w:type="character" w:customStyle="1" w:styleId="TitleChar">
+  <w:style w:type="character" w:styleId="TitleChar" w:customStyle="1">
     <w:name w:val="Title Char"/>
     <w:basedOn w:val="DefaultParagraphFont"/>
     <w:link w:val="Title"/>
     <w:uiPriority w:val="10"/>
     <w:rsid w:val="004C6ED6"/>
     <w:rPr>
-      <w:rFonts w:asciiTheme="majorHAnsi" w:eastAsiaTheme="majorEastAsia" w:hAnsiTheme="majorHAnsi" w:cstheme="majorBidi"/>
+      <w:rFonts w:asciiTheme="majorHAnsi" w:hAnsiTheme="majorHAnsi" w:eastAsiaTheme="majorEastAsia" w:cstheme="majorBidi"/>
       <w:spacing w:val="-10"/>
       <w:kern w:val="28"/>
       <w:sz w:val="56"/>
@@ -4710,7 +4751,7 @@
       <w:szCs w:val="28"/>
     </w:rPr>
   </w:style>
-  <w:style w:type="character" w:customStyle="1" w:styleId="SubtitleChar">
+  <w:style w:type="character" w:styleId="SubtitleChar" w:customStyle="1">
     <w:name w:val="Subtitle Char"/>
     <w:basedOn w:val="DefaultParagraphFont"/>
     <w:link w:val="Subtitle"/>
@@ -4742,7 +4783,7 @@
       <w:color w:val="404040" w:themeColor="text1" w:themeTint="BF"/>
     </w:rPr>
   </w:style>
-  <w:style w:type="character" w:customStyle="1" w:styleId="QuoteChar">
+  <w:style w:type="character" w:styleId="QuoteChar" w:customStyle="1">
     <w:name w:val="Quote Char"/>
     <w:basedOn w:val="DefaultParagraphFont"/>
     <w:link w:val="Quote"/>
@@ -4787,8 +4828,8 @@
     <w:rsid w:val="004C6ED6"/>
     <w:pPr>
       <w:pBdr>
-        <w:top w:val="single" w:sz="4" w:space="10" w:color="0F4761" w:themeColor="accent1" w:themeShade="BF"/>
-        <w:bottom w:val="single" w:sz="4" w:space="10" w:color="0F4761" w:themeColor="accent1" w:themeShade="BF"/>
+        <w:top w:val="single" w:color="0F4761" w:themeColor="accent1" w:themeShade="BF" w:sz="4" w:space="10"/>
+        <w:bottom w:val="single" w:color="0F4761" w:themeColor="accent1" w:themeShade="BF" w:sz="4" w:space="10"/>
       </w:pBdr>
       <w:spacing w:before="360" w:after="360"/>
       <w:ind w:left="864" w:right="864"/>
@@ -4800,7 +4841,7 @@
       <w:color w:val="0F4761" w:themeColor="accent1" w:themeShade="BF"/>
     </w:rPr>
   </w:style>
-  <w:style w:type="character" w:customStyle="1" w:styleId="IntenseQuoteChar">
+  <w:style w:type="character" w:styleId="IntenseQuoteChar" w:customStyle="1">
     <w:name w:val="Intense Quote Char"/>
     <w:basedOn w:val="DefaultParagraphFont"/>
     <w:link w:val="IntenseQuote"/>
@@ -4826,7 +4867,7 @@
       <w:spacing w:val="5"/>
     </w:rPr>
   </w:style>
-  <w:style w:type="paragraph" w:customStyle="1" w:styleId="CNLevel1Text">
+  <w:style w:type="paragraph" w:styleId="CNLevel1Text" w:customStyle="1">
     <w:name w:val="CN Level 1 Text"/>
     <w:basedOn w:val="CNParagraph"/>
     <w:rsid w:val="004C6ED6"/>
@@ -4834,7 +4875,7 @@
       <w:ind w:left="1224"/>
     </w:pPr>
   </w:style>
-  <w:style w:type="paragraph" w:customStyle="1" w:styleId="CNParagraph">
+  <w:style w:type="paragraph" w:styleId="CNParagraph" w:customStyle="1">
     <w:name w:val="CN Paragraph"/>
     <w:link w:val="CNParagraphChar"/>
     <w:rsid w:val="004C6ED6"/>
@@ -4843,14 +4884,14 @@
       <w:ind w:left="720"/>
     </w:pPr>
     <w:rPr>
-      <w:rFonts w:ascii="Arial" w:eastAsia="Times New Roman" w:hAnsi="Arial" w:cs="Times New Roman"/>
+      <w:rFonts w:ascii="Arial" w:hAnsi="Arial" w:eastAsia="Times New Roman" w:cs="Times New Roman"/>
       <w:kern w:val="0"/>
       <w:sz w:val="20"/>
       <w:szCs w:val="18"/>
       <w14:ligatures w14:val="none"/>
     </w:rPr>
   </w:style>
-  <w:style w:type="paragraph" w:customStyle="1" w:styleId="CNLevel1Bullet">
+  <w:style w:type="paragraph" w:styleId="CNLevel1Bullet" w:customStyle="1">
     <w:name w:val="CN Level 1 Bullet"/>
     <w:basedOn w:val="CNParagraph"/>
     <w:rsid w:val="004C6ED6"/>
@@ -4865,7 +4906,7 @@
       <w:ind w:left="720" w:firstLine="0"/>
     </w:pPr>
   </w:style>
-  <w:style w:type="paragraph" w:customStyle="1" w:styleId="CNLevel2Bullet">
+  <w:style w:type="paragraph" w:styleId="CNLevel2Bullet" w:customStyle="1">
     <w:name w:val="CN Level 2 Bullet"/>
     <w:basedOn w:val="CNParagraph"/>
     <w:rsid w:val="004C6ED6"/>
@@ -4881,7 +4922,7 @@
       <w:ind w:left="720" w:firstLine="0"/>
     </w:pPr>
   </w:style>
-  <w:style w:type="paragraph" w:customStyle="1" w:styleId="CNLevel3Bullet">
+  <w:style w:type="paragraph" w:styleId="CNLevel3Bullet" w:customStyle="1">
     <w:name w:val="CN Level 3 Bullet"/>
     <w:basedOn w:val="CNParagraph"/>
     <w:rsid w:val="004C6ED6"/>
@@ -4897,7 +4938,7 @@
       <w:ind w:left="720" w:firstLine="0"/>
     </w:pPr>
   </w:style>
-  <w:style w:type="paragraph" w:customStyle="1" w:styleId="CNLevel4Bullet">
+  <w:style w:type="paragraph" w:styleId="CNLevel4Bullet" w:customStyle="1">
     <w:name w:val="CN Level 4 Bullet"/>
     <w:basedOn w:val="CNParagraph"/>
     <w:rsid w:val="004C6ED6"/>
@@ -4913,7 +4954,7 @@
       <w:ind w:left="720" w:firstLine="0"/>
     </w:pPr>
   </w:style>
-  <w:style w:type="paragraph" w:customStyle="1" w:styleId="CNLevel5Bullet">
+  <w:style w:type="paragraph" w:styleId="CNLevel5Bullet" w:customStyle="1">
     <w:name w:val="CN Level 5 Bullet"/>
     <w:basedOn w:val="CNParagraph"/>
     <w:rsid w:val="004C6ED6"/>
@@ -4929,7 +4970,7 @@
       <w:ind w:left="720" w:firstLine="0"/>
     </w:pPr>
   </w:style>
-  <w:style w:type="paragraph" w:customStyle="1" w:styleId="CNLevel6Bullet">
+  <w:style w:type="paragraph" w:styleId="CNLevel6Bullet" w:customStyle="1">
     <w:name w:val="CN Level 6 Bullet"/>
     <w:basedOn w:val="CNParagraph"/>
     <w:rsid w:val="004C6ED6"/>
@@ -4945,7 +4986,7 @@
       <w:ind w:left="720" w:firstLine="0"/>
     </w:pPr>
   </w:style>
-  <w:style w:type="paragraph" w:customStyle="1" w:styleId="CNHead1">
+  <w:style w:type="paragraph" w:styleId="CNHead1" w:customStyle="1">
     <w:name w:val="CN Head 1"/>
     <w:basedOn w:val="CNParagraph"/>
     <w:next w:val="CNParagraph"/>
@@ -4971,7 +5012,7 @@
       <w:sz w:val="24"/>
     </w:rPr>
   </w:style>
-  <w:style w:type="paragraph" w:customStyle="1" w:styleId="CNHead2">
+  <w:style w:type="paragraph" w:styleId="CNHead2" w:customStyle="1">
     <w:name w:val="CN Head 2"/>
     <w:basedOn w:val="CNParagraph"/>
     <w:next w:val="CNParagraph"/>
@@ -4997,7 +5038,7 @@
       <w:sz w:val="22"/>
     </w:rPr>
   </w:style>
-  <w:style w:type="paragraph" w:customStyle="1" w:styleId="CNHead3">
+  <w:style w:type="paragraph" w:styleId="CNHead3" w:customStyle="1">
     <w:name w:val="CN Head 3"/>
     <w:basedOn w:val="CNParagraph"/>
     <w:next w:val="CNParagraph"/>
@@ -5020,13 +5061,13 @@
       <w:b/>
     </w:rPr>
   </w:style>
-  <w:style w:type="paragraph" w:customStyle="1" w:styleId="CNInternalNoteText">
+  <w:style w:type="paragraph" w:styleId="CNInternalNoteText" w:customStyle="1">
     <w:name w:val="CN Internal Note Text"/>
     <w:basedOn w:val="CNParagraph"/>
     <w:rsid w:val="004C6ED6"/>
     <w:pPr>
       <w:pBdr>
-        <w:right w:val="single" w:sz="18" w:space="4" w:color="FF0000"/>
+        <w:right w:val="single" w:color="FF0000" w:sz="18" w:space="4"/>
       </w:pBdr>
       <w:spacing w:before="28" w:after="28"/>
       <w:ind w:left="0"/>
@@ -5038,7 +5079,7 @@
       <w:szCs w:val="20"/>
     </w:rPr>
   </w:style>
-  <w:style w:type="paragraph" w:customStyle="1" w:styleId="CNLevel1List">
+  <w:style w:type="paragraph" w:styleId="CNLevel1List" w:customStyle="1">
     <w:name w:val="CN Level 1 List"/>
     <w:basedOn w:val="CNParagraph"/>
     <w:link w:val="CNLevel1ListChar"/>
@@ -5052,7 +5093,7 @@
       <w:ind w:left="1225" w:hanging="505"/>
     </w:pPr>
   </w:style>
-  <w:style w:type="paragraph" w:customStyle="1" w:styleId="CNLevel2List">
+  <w:style w:type="paragraph" w:styleId="CNLevel2List" w:customStyle="1">
     <w:name w:val="CN Level 2 List"/>
     <w:basedOn w:val="CNParagraph"/>
     <w:rsid w:val="004C6ED6"/>
@@ -5068,7 +5109,7 @@
       <w:ind w:left="720" w:firstLine="0"/>
     </w:pPr>
   </w:style>
-  <w:style w:type="paragraph" w:customStyle="1" w:styleId="CNLevel3List">
+  <w:style w:type="paragraph" w:styleId="CNLevel3List" w:customStyle="1">
     <w:name w:val="CN Level 3 List"/>
     <w:basedOn w:val="CNParagraph"/>
     <w:rsid w:val="004C6ED6"/>
@@ -5084,7 +5125,7 @@
       <w:ind w:left="720" w:firstLine="0"/>
     </w:pPr>
   </w:style>
-  <w:style w:type="paragraph" w:customStyle="1" w:styleId="CNLevel4List">
+  <w:style w:type="paragraph" w:styleId="CNLevel4List" w:customStyle="1">
     <w:name w:val="CN Level 4 List"/>
     <w:basedOn w:val="CNParagraph"/>
     <w:rsid w:val="004C6ED6"/>
@@ -5100,7 +5141,7 @@
       <w:ind w:left="720" w:firstLine="0"/>
     </w:pPr>
   </w:style>
-  <w:style w:type="paragraph" w:customStyle="1" w:styleId="CNLevel5List">
+  <w:style w:type="paragraph" w:styleId="CNLevel5List" w:customStyle="1">
     <w:name w:val="CN Level 5 List"/>
     <w:basedOn w:val="CNParagraph"/>
     <w:rsid w:val="004C6ED6"/>
@@ -5116,13 +5157,13 @@
       <w:ind w:left="720" w:firstLine="0"/>
     </w:pPr>
   </w:style>
-  <w:style w:type="character" w:customStyle="1" w:styleId="CNParagraphChar">
+  <w:style w:type="character" w:styleId="CNParagraphChar" w:customStyle="1">
     <w:name w:val="CN Paragraph Char"/>
     <w:basedOn w:val="DefaultParagraphFont"/>
     <w:link w:val="CNParagraph"/>
     <w:rsid w:val="004C6ED6"/>
     <w:rPr>
-      <w:rFonts w:ascii="Arial" w:eastAsia="Times New Roman" w:hAnsi="Arial" w:cs="Times New Roman"/>
+      <w:rFonts w:ascii="Arial" w:hAnsi="Arial" w:eastAsia="Times New Roman" w:cs="Times New Roman"/>
       <w:kern w:val="0"/>
       <w:sz w:val="20"/>
       <w:szCs w:val="18"/>
@@ -5130,7 +5171,7 @@
       <w14:ligatures w14:val="none"/>
     </w:rPr>
   </w:style>
-  <w:style w:type="paragraph" w:customStyle="1" w:styleId="CNParagraphBold">
+  <w:style w:type="paragraph" w:styleId="CNParagraphBold" w:customStyle="1">
     <w:name w:val="CN Paragraph Bold"/>
     <w:basedOn w:val="CNParagraph"/>
     <w:rsid w:val="004C6ED6"/>
@@ -5142,7 +5183,7 @@
       <w:b/>
     </w:rPr>
   </w:style>
-  <w:style w:type="paragraph" w:customStyle="1" w:styleId="CNSignatureBlock">
+  <w:style w:type="paragraph" w:styleId="CNSignatureBlock" w:customStyle="1">
     <w:name w:val="CN Signature Block"/>
     <w:basedOn w:val="CNParagraph"/>
     <w:rsid w:val="004C6ED6"/>
@@ -5151,7 +5192,7 @@
       <w:ind w:left="0"/>
     </w:pPr>
   </w:style>
-  <w:style w:type="paragraph" w:customStyle="1" w:styleId="CNSignatureBlockBold">
+  <w:style w:type="paragraph" w:styleId="CNSignatureBlockBold" w:customStyle="1">
     <w:name w:val="CN Signature Block Bold"/>
     <w:basedOn w:val="CNSignatureBlock"/>
     <w:next w:val="CNSignatureBlock"/>
@@ -5160,7 +5201,7 @@
       <w:b/>
     </w:rPr>
   </w:style>
-  <w:style w:type="paragraph" w:customStyle="1" w:styleId="CNTableTextLeft">
+  <w:style w:type="paragraph" w:styleId="CNTableTextLeft" w:customStyle="1">
     <w:name w:val="CN Table Text Left"/>
     <w:basedOn w:val="CNParagraph"/>
     <w:rsid w:val="004C6ED6"/>
@@ -5172,7 +5213,7 @@
       <w:sz w:val="18"/>
     </w:rPr>
   </w:style>
-  <w:style w:type="paragraph" w:customStyle="1" w:styleId="CNTableColumnHead">
+  <w:style w:type="paragraph" w:styleId="CNTableColumnHead" w:customStyle="1">
     <w:name w:val="CN Table Column Head"/>
     <w:basedOn w:val="CNTableTextLeft"/>
     <w:rsid w:val="004C6ED6"/>
@@ -5184,7 +5225,7 @@
       <w:b/>
     </w:rPr>
   </w:style>
-  <w:style w:type="paragraph" w:customStyle="1" w:styleId="CNTableTextBold">
+  <w:style w:type="paragraph" w:styleId="CNTableTextBold" w:customStyle="1">
     <w:name w:val="CN Table Text Bold"/>
     <w:basedOn w:val="CNTableTextLeft"/>
     <w:rsid w:val="004C6ED6"/>
@@ -5192,7 +5233,7 @@
       <w:b/>
     </w:rPr>
   </w:style>
-  <w:style w:type="paragraph" w:customStyle="1" w:styleId="CNTableTextCentered">
+  <w:style w:type="paragraph" w:styleId="CNTableTextCentered" w:customStyle="1">
     <w:name w:val="CN Table Text Centered"/>
     <w:basedOn w:val="CNTableTextLeft"/>
     <w:rsid w:val="004C6ED6"/>
@@ -5200,7 +5241,7 @@
       <w:jc w:val="center"/>
     </w:pPr>
   </w:style>
-  <w:style w:type="paragraph" w:customStyle="1" w:styleId="CNTitle">
+  <w:style w:type="paragraph" w:styleId="CNTitle" w:customStyle="1">
     <w:name w:val="CN Title"/>
     <w:basedOn w:val="CNParagraph"/>
     <w:rsid w:val="004C6ED6"/>
@@ -5222,7 +5263,7 @@
       <w:sz w:val="28"/>
     </w:rPr>
   </w:style>
-  <w:style w:type="paragraph" w:customStyle="1" w:styleId="CNFooter">
+  <w:style w:type="paragraph" w:styleId="CNFooter" w:customStyle="1">
     <w:name w:val="CN Footer"/>
     <w:basedOn w:val="CNParagraph"/>
     <w:rsid w:val="004C6ED6"/>
@@ -5256,14 +5297,14 @@
       <w:lang w:eastAsia="en-US"/>
     </w:rPr>
   </w:style>
-  <w:style w:type="character" w:customStyle="1" w:styleId="HeaderChar">
+  <w:style w:type="character" w:styleId="HeaderChar" w:customStyle="1">
     <w:name w:val="Header Char"/>
     <w:basedOn w:val="DefaultParagraphFont"/>
     <w:link w:val="Header"/>
     <w:semiHidden/>
     <w:rsid w:val="004C6ED6"/>
     <w:rPr>
-      <w:rFonts w:ascii="Courier New" w:eastAsia="Times New Roman" w:hAnsi="Courier New" w:cs="Times New Roman"/>
+      <w:rFonts w:ascii="Courier New" w:hAnsi="Courier New" w:eastAsia="Times New Roman" w:cs="Times New Roman"/>
       <w:kern w:val="0"/>
       <w:sz w:val="20"/>
       <w:lang w:val="en-US"/>
@@ -5279,7 +5320,7 @@
       <w:u w:val="single"/>
     </w:rPr>
   </w:style>
-  <w:style w:type="paragraph" w:customStyle="1" w:styleId="CNParagraphLeft">
+  <w:style w:type="paragraph" w:styleId="CNParagraphLeft" w:customStyle="1">
     <w:name w:val="CN Paragraph Left"/>
     <w:basedOn w:val="CNParagraph"/>
     <w:link w:val="CNParagraphLeftChar"/>
@@ -5288,7 +5329,7 @@
       <w:ind w:left="0"/>
     </w:pPr>
   </w:style>
-  <w:style w:type="paragraph" w:customStyle="1" w:styleId="CNParagraphLeftBold">
+  <w:style w:type="paragraph" w:styleId="CNParagraphLeftBold" w:customStyle="1">
     <w:name w:val="CN Paragraph Left Bold"/>
     <w:basedOn w:val="CNParagraphLeft"/>
     <w:rsid w:val="004C6ED6"/>
@@ -5296,18 +5337,18 @@
       <w:b/>
     </w:rPr>
   </w:style>
-  <w:style w:type="paragraph" w:customStyle="1" w:styleId="CNSignatureBlockBegin">
+  <w:style w:type="paragraph" w:styleId="CNSignatureBlockBegin" w:customStyle="1">
     <w:name w:val="CN Signature Block Begin"/>
     <w:basedOn w:val="CNSignatureBlock"/>
     <w:next w:val="CNSignatureBlock"/>
     <w:rsid w:val="004C6ED6"/>
     <w:pPr>
       <w:pBdr>
-        <w:top w:val="single" w:sz="8" w:space="1" w:color="auto"/>
+        <w:top w:val="single" w:color="auto" w:sz="8" w:space="1"/>
       </w:pBdr>
     </w:pPr>
   </w:style>
-  <w:style w:type="paragraph" w:customStyle="1" w:styleId="CNTitleUnderscore">
+  <w:style w:type="paragraph" w:styleId="CNTitleUnderscore" w:customStyle="1">
     <w:name w:val="CN Title Underscore"/>
     <w:basedOn w:val="CNTitle"/>
     <w:next w:val="CNParagraphLeft"/>
@@ -5317,18 +5358,18 @@
         <w:numId w:val="0"/>
       </w:numPr>
       <w:pBdr>
-        <w:bottom w:val="single" w:sz="12" w:space="2" w:color="auto"/>
+        <w:bottom w:val="single" w:color="auto" w:sz="12" w:space="2"/>
       </w:pBdr>
       <w:jc w:val="left"/>
     </w:pPr>
   </w:style>
-  <w:style w:type="character" w:customStyle="1" w:styleId="CNParagraphLeftChar">
+  <w:style w:type="character" w:styleId="CNParagraphLeftChar" w:customStyle="1">
     <w:name w:val="CN Paragraph Left Char"/>
     <w:link w:val="CNParagraphLeft"/>
     <w:locked/>
     <w:rsid w:val="004C6ED6"/>
     <w:rPr>
-      <w:rFonts w:ascii="Arial" w:eastAsia="Times New Roman" w:hAnsi="Arial" w:cs="Times New Roman"/>
+      <w:rFonts w:ascii="Arial" w:hAnsi="Arial" w:eastAsia="Times New Roman" w:cs="Times New Roman"/>
       <w:kern w:val="0"/>
       <w:sz w:val="20"/>
       <w:szCs w:val="18"/>
@@ -5336,13 +5377,13 @@
       <w14:ligatures w14:val="none"/>
     </w:rPr>
   </w:style>
-  <w:style w:type="character" w:customStyle="1" w:styleId="CNLevel1ListChar">
+  <w:style w:type="character" w:styleId="CNLevel1ListChar" w:customStyle="1">
     <w:name w:val="CN Level 1 List Char"/>
     <w:link w:val="CNLevel1List"/>
     <w:locked/>
     <w:rsid w:val="004C6ED6"/>
     <w:rPr>
-      <w:rFonts w:ascii="Arial" w:eastAsia="Times New Roman" w:hAnsi="Arial" w:cs="Times New Roman"/>
+      <w:rFonts w:ascii="Arial" w:hAnsi="Arial" w:eastAsia="Times New Roman" w:cs="Times New Roman"/>
       <w:kern w:val="0"/>
       <w:sz w:val="20"/>
       <w:szCs w:val="18"/>
@@ -5372,7 +5413,7 @@
       <w:spacing w:after="0" w:line="240" w:lineRule="auto"/>
     </w:pPr>
     <w:rPr>
-      <w:rFonts w:ascii="Arial" w:eastAsia="Times New Roman" w:hAnsi="Arial" w:cs="Courier New"/>
+      <w:rFonts w:ascii="Arial" w:hAnsi="Arial" w:eastAsia="Times New Roman" w:cs="Courier New"/>
       <w:kern w:val="0"/>
       <w:sz w:val="20"/>
       <w:szCs w:val="20"/>
@@ -5384,7 +5425,7 @@
 </file>
 
 <file path=word/theme/theme1.xml><?xml version="1.0" encoding="utf-8"?>
-<a:theme xmlns:a="http://schemas.openxmlformats.org/drawingml/2006/main" name="Office Theme">
+<a:theme xmlns:a="http://schemas.openxmlformats.org/drawingml/2006/main" xmlns:thm15="http://schemas.microsoft.com/office/thememl/2012/main" name="Office Theme">
   <a:themeElements>
     <a:clrScheme name="Office">
       <a:dk1>

</xml_diff>